<commit_message>
Add Lab 3 report
</commit_message>
<xml_diff>
--- a/docs/lab3/Oleksii_Budkov_KN226e_Var3_Lab3.docx
+++ b/docs/lab3/Oleksii_Budkov_KN226e_Var3_Lab3.docx
@@ -839,52 +839,48 @@
         <w:t xml:space="preserve">GitHub is a web platform for version control and teamwork. It stores the repository of the project with the full history of changes and gives tools for planning the work: milestones, issues, labels and assignees. A free account was registered on https://github.com/signup (Figure 3.1).</w:t>
       </w:r>
     </w:p>
-    <w:tbl>
-      <w:tblPr>
-        <w:tblW w:type="dxa" w:w="9500"/>
-        <w:tblBorders>
-          <w:top w:val="single" w:color="auto" w:sz="4"/>
-          <w:left w:val="single" w:color="auto" w:sz="4"/>
-          <w:bottom w:val="single" w:color="auto" w:sz="4"/>
-          <w:right w:val="single" w:color="auto" w:sz="4"/>
-          <w:insideH w:val="single" w:color="auto" w:sz="4"/>
-          <w:insideV w:val="single" w:color="auto" w:sz="4"/>
-        </w:tblBorders>
-      </w:tblPr>
-      <w:tblGrid>
-        <w:gridCol w:w="9500"/>
-      </w:tblGrid>
-      <w:tr>
-        <w:tc>
-          <w:tcPr>
-            <w:tcW w:type="dxa" w:w="9500"/>
-            <w:shd w:fill="F2F2F2" w:val="clear"/>
-            <w:tcMar>
-              <w:top w:type="dxa" w:w="500"/>
-              <w:left w:type="dxa" w:w="200"/>
-              <w:bottom w:type="dxa" w:w="500"/>
-              <w:right w:type="dxa" w:w="200"/>
-            </w:tcMar>
-          </w:tcPr>
-          <w:p>
-            <w:pPr>
-              <w:keepNext/>
-              <w:jc w:val="center"/>
-            </w:pPr>
-            <w:r>
-              <w:rPr>
-                <w:rFonts w:ascii="Arial" w:cs="Arial" w:eastAsia="Arial" w:hAnsi="Arial"/>
-                <w:i/>
-                <w:iCs/>
-                <w:sz w:val="20"/>
-                <w:szCs w:val="20"/>
-              </w:rPr>
-              <w:t xml:space="preserve">[ Insert screenshot: your GitHub profile page after registration ]</w:t>
-            </w:r>
-          </w:p>
-        </w:tc>
-      </w:tr>
-    </w:tbl>
+    <w:p>
+      <w:pPr>
+        <w:keepNext/>
+        <w:spacing w:before="113"/>
+        <w:ind w:firstLine="0" w:left="0"/>
+        <w:jc w:val="center"/>
+      </w:pPr>
+      <w:r>
+        <w:drawing>
+          <wp:inline xmlns:a="http://schemas.openxmlformats.org/drawingml/2006/main" xmlns:pic="http://schemas.openxmlformats.org/drawingml/2006/picture">
+            <wp:extent cx="5760000" cy="2495307"/>
+            <wp:docPr id="1" name="Picture 1"/>
+            <wp:cNvGraphicFramePr>
+              <a:graphicFrameLocks noChangeAspect="1"/>
+            </wp:cNvGraphicFramePr>
+            <a:graphic>
+              <a:graphicData uri="http://schemas.openxmlformats.org/drawingml/2006/picture">
+                <pic:pic>
+                  <pic:nvPicPr>
+                    <pic:cNvPr id="0" name="figure_3_1.png"/>
+                    <pic:cNvPicPr/>
+                  </pic:nvPicPr>
+                  <pic:blipFill>
+                    <a:blip r:embed="rId8"/>
+                    <a:stretch>
+                      <a:fillRect/>
+                    </a:stretch>
+                  </pic:blipFill>
+                  <pic:spPr>
+                    <a:xfrm>
+                      <a:off x="0" y="0"/>
+                      <a:ext cx="5760000" cy="2495307"/>
+                    </a:xfrm>
+                    <a:prstGeom prst="rect"/>
+                  </pic:spPr>
+                </pic:pic>
+              </a:graphicData>
+            </a:graphic>
+          </wp:inline>
+        </w:drawing>
+      </w:r>
+    </w:p>
     <w:p>
       <w:pPr>
         <w:spacing w:after="200" w:before="60"/>
@@ -928,52 +924,48 @@
         <w:t xml:space="preserve">A new public repository SE-Lab-Var3 was created with the button “New” (Figure 3.2). Its description is “Function Table Calculator (Variant 3) – laboratory works of the discipline Software Engineering”. The repository stores the C++ program, the reports and the diagrams of all labs (Figure 3.3); the file README.md describes the program and the structure of the repository.</w:t>
       </w:r>
     </w:p>
-    <w:tbl>
-      <w:tblPr>
-        <w:tblW w:type="dxa" w:w="9500"/>
-        <w:tblBorders>
-          <w:top w:val="single" w:color="auto" w:sz="4"/>
-          <w:left w:val="single" w:color="auto" w:sz="4"/>
-          <w:bottom w:val="single" w:color="auto" w:sz="4"/>
-          <w:right w:val="single" w:color="auto" w:sz="4"/>
-          <w:insideH w:val="single" w:color="auto" w:sz="4"/>
-          <w:insideV w:val="single" w:color="auto" w:sz="4"/>
-        </w:tblBorders>
-      </w:tblPr>
-      <w:tblGrid>
-        <w:gridCol w:w="9500"/>
-      </w:tblGrid>
-      <w:tr>
-        <w:tc>
-          <w:tcPr>
-            <w:tcW w:type="dxa" w:w="9500"/>
-            <w:shd w:fill="F2F2F2" w:val="clear"/>
-            <w:tcMar>
-              <w:top w:type="dxa" w:w="500"/>
-              <w:left w:type="dxa" w:w="200"/>
-              <w:bottom w:type="dxa" w:w="500"/>
-              <w:right w:type="dxa" w:w="200"/>
-            </w:tcMar>
-          </w:tcPr>
-          <w:p>
-            <w:pPr>
-              <w:keepNext/>
-              <w:jc w:val="center"/>
-            </w:pPr>
-            <w:r>
-              <w:rPr>
-                <w:rFonts w:ascii="Arial" w:cs="Arial" w:eastAsia="Arial" w:hAnsi="Arial"/>
-                <w:i/>
-                <w:iCs/>
-                <w:sz w:val="20"/>
-                <w:szCs w:val="20"/>
-              </w:rPr>
-              <w:t xml:space="preserve">[ Insert screenshot: the page “Create a new repository” with the name and description filled in ]</w:t>
-            </w:r>
-          </w:p>
-        </w:tc>
-      </w:tr>
-    </w:tbl>
+    <w:p>
+      <w:pPr>
+        <w:keepNext/>
+        <w:spacing w:before="113"/>
+        <w:ind w:firstLine="0" w:left="0"/>
+        <w:jc w:val="center"/>
+      </w:pPr>
+      <w:r>
+        <w:drawing>
+          <wp:inline xmlns:a="http://schemas.openxmlformats.org/drawingml/2006/main" xmlns:pic="http://schemas.openxmlformats.org/drawingml/2006/picture">
+            <wp:extent cx="5760000" cy="5691924"/>
+            <wp:docPr id="2" name="Picture 2"/>
+            <wp:cNvGraphicFramePr>
+              <a:graphicFrameLocks noChangeAspect="1"/>
+            </wp:cNvGraphicFramePr>
+            <a:graphic>
+              <a:graphicData uri="http://schemas.openxmlformats.org/drawingml/2006/picture">
+                <pic:pic>
+                  <pic:nvPicPr>
+                    <pic:cNvPr id="0" name="figure_3_2.png"/>
+                    <pic:cNvPicPr/>
+                  </pic:nvPicPr>
+                  <pic:blipFill>
+                    <a:blip r:embed="rId9"/>
+                    <a:stretch>
+                      <a:fillRect/>
+                    </a:stretch>
+                  </pic:blipFill>
+                  <pic:spPr>
+                    <a:xfrm>
+                      <a:off x="0" y="0"/>
+                      <a:ext cx="5760000" cy="5691924"/>
+                    </a:xfrm>
+                    <a:prstGeom prst="rect"/>
+                  </pic:spPr>
+                </pic:pic>
+              </a:graphicData>
+            </a:graphic>
+          </wp:inline>
+        </w:drawing>
+      </w:r>
+    </w:p>
     <w:p>
       <w:pPr>
         <w:spacing w:after="200" w:before="60"/>
@@ -988,52 +980,48 @@
         <w:t xml:space="preserve">Figure 3.2 – Creating of a new repository</w:t>
       </w:r>
     </w:p>
-    <w:tbl>
-      <w:tblPr>
-        <w:tblW w:type="dxa" w:w="9500"/>
-        <w:tblBorders>
-          <w:top w:val="single" w:color="auto" w:sz="4"/>
-          <w:left w:val="single" w:color="auto" w:sz="4"/>
-          <w:bottom w:val="single" w:color="auto" w:sz="4"/>
-          <w:right w:val="single" w:color="auto" w:sz="4"/>
-          <w:insideH w:val="single" w:color="auto" w:sz="4"/>
-          <w:insideV w:val="single" w:color="auto" w:sz="4"/>
-        </w:tblBorders>
-      </w:tblPr>
-      <w:tblGrid>
-        <w:gridCol w:w="9500"/>
-      </w:tblGrid>
-      <w:tr>
-        <w:tc>
-          <w:tcPr>
-            <w:tcW w:type="dxa" w:w="9500"/>
-            <w:shd w:fill="F2F2F2" w:val="clear"/>
-            <w:tcMar>
-              <w:top w:type="dxa" w:w="500"/>
-              <w:left w:type="dxa" w:w="200"/>
-              <w:bottom w:type="dxa" w:w="500"/>
-              <w:right w:type="dxa" w:w="200"/>
-            </w:tcMar>
-          </w:tcPr>
-          <w:p>
-            <w:pPr>
-              <w:keepNext/>
-              <w:jc w:val="center"/>
-            </w:pPr>
-            <w:r>
-              <w:rPr>
-                <w:rFonts w:ascii="Arial" w:cs="Arial" w:eastAsia="Arial" w:hAnsi="Arial"/>
-                <w:i/>
-                <w:iCs/>
-                <w:sz w:val="20"/>
-                <w:szCs w:val="20"/>
-              </w:rPr>
-              <w:t xml:space="preserve">[ Insert screenshot: the main page of the repository (tab “Code”) ]</w:t>
-            </w:r>
-          </w:p>
-        </w:tc>
-      </w:tr>
-    </w:tbl>
+    <w:p>
+      <w:pPr>
+        <w:keepNext/>
+        <w:spacing w:before="113"/>
+        <w:ind w:firstLine="0" w:left="0"/>
+        <w:jc w:val="center"/>
+      </w:pPr>
+      <w:r>
+        <w:drawing>
+          <wp:inline xmlns:a="http://schemas.openxmlformats.org/drawingml/2006/main" xmlns:pic="http://schemas.openxmlformats.org/drawingml/2006/picture">
+            <wp:extent cx="5760000" cy="4712727"/>
+            <wp:docPr id="3" name="Picture 3"/>
+            <wp:cNvGraphicFramePr>
+              <a:graphicFrameLocks noChangeAspect="1"/>
+            </wp:cNvGraphicFramePr>
+            <a:graphic>
+              <a:graphicData uri="http://schemas.openxmlformats.org/drawingml/2006/picture">
+                <pic:pic>
+                  <pic:nvPicPr>
+                    <pic:cNvPr id="0" name="figure_3_3.png"/>
+                    <pic:cNvPicPr/>
+                  </pic:nvPicPr>
+                  <pic:blipFill>
+                    <a:blip r:embed="rId10"/>
+                    <a:stretch>
+                      <a:fillRect/>
+                    </a:stretch>
+                  </pic:blipFill>
+                  <pic:spPr>
+                    <a:xfrm>
+                      <a:off x="0" y="0"/>
+                      <a:ext cx="5760000" cy="4712727"/>
+                    </a:xfrm>
+                    <a:prstGeom prst="rect"/>
+                  </pic:spPr>
+                </pic:pic>
+              </a:graphicData>
+            </a:graphic>
+          </wp:inline>
+        </w:drawing>
+      </w:r>
+    </w:p>
     <w:p>
       <w:pPr>
         <w:spacing w:after="200" w:before="60"/>
@@ -1074,55 +1062,51 @@
           <w:sz w:val="24"/>
           <w:szCs w:val="24"/>
         </w:rPr>
-        <w:t xml:space="preserve">A second member of the team was added in Settings → Collaborators → Add people (Figure 3.4). After the invitation is accepted, the collaborator can push changes to the repository and can be assigned to issues.</w:t>
-      </w:r>
-    </w:p>
-    <w:tbl>
-      <w:tblPr>
-        <w:tblW w:type="dxa" w:w="9500"/>
-        <w:tblBorders>
-          <w:top w:val="single" w:color="auto" w:sz="4"/>
-          <w:left w:val="single" w:color="auto" w:sz="4"/>
-          <w:bottom w:val="single" w:color="auto" w:sz="4"/>
-          <w:right w:val="single" w:color="auto" w:sz="4"/>
-          <w:insideH w:val="single" w:color="auto" w:sz="4"/>
-          <w:insideV w:val="single" w:color="auto" w:sz="4"/>
-        </w:tblBorders>
-      </w:tblPr>
-      <w:tblGrid>
-        <w:gridCol w:w="9500"/>
-      </w:tblGrid>
-      <w:tr>
-        <w:tc>
-          <w:tcPr>
-            <w:tcW w:type="dxa" w:w="9500"/>
-            <w:shd w:fill="F2F2F2" w:val="clear"/>
-            <w:tcMar>
-              <w:top w:type="dxa" w:w="500"/>
-              <w:left w:type="dxa" w:w="200"/>
-              <w:bottom w:type="dxa" w:w="500"/>
-              <w:right w:type="dxa" w:w="200"/>
-            </w:tcMar>
-          </w:tcPr>
-          <w:p>
-            <w:pPr>
-              <w:keepNext/>
-              <w:jc w:val="center"/>
-            </w:pPr>
-            <w:r>
-              <w:rPr>
-                <w:rFonts w:ascii="Arial" w:cs="Arial" w:eastAsia="Arial" w:hAnsi="Arial"/>
-                <w:i/>
-                <w:iCs/>
-                <w:sz w:val="20"/>
-                <w:szCs w:val="20"/>
-              </w:rPr>
-              <w:t xml:space="preserve">[ Insert screenshot: Settings → Collaborators with the invited user ]</w:t>
-            </w:r>
-          </w:p>
-        </w:tc>
-      </w:tr>
-    </w:tbl>
+        <w:t>The project is developed by one person, so no second member was invited. A collaborator is invited on the page Settings → Collaborators → Add people (Figure 3.4): after the invitation is accepted, the collaborator can push changes to the repository and can be assigned to issues. All issues of the project are assigned to the author of the repository.</w:t>
+      </w:r>
+    </w:p>
+    <w:p>
+      <w:pPr>
+        <w:keepNext/>
+        <w:spacing w:before="113"/>
+        <w:ind w:firstLine="0" w:left="0"/>
+        <w:jc w:val="center"/>
+      </w:pPr>
+      <w:r>
+        <w:drawing>
+          <wp:inline xmlns:a="http://schemas.openxmlformats.org/drawingml/2006/main" xmlns:pic="http://schemas.openxmlformats.org/drawingml/2006/picture">
+            <wp:extent cx="5760000" cy="2610581"/>
+            <wp:docPr id="4" name="Picture 4"/>
+            <wp:cNvGraphicFramePr>
+              <a:graphicFrameLocks noChangeAspect="1"/>
+            </wp:cNvGraphicFramePr>
+            <a:graphic>
+              <a:graphicData uri="http://schemas.openxmlformats.org/drawingml/2006/picture">
+                <pic:pic>
+                  <pic:nvPicPr>
+                    <pic:cNvPr id="0" name="figure_3_4.png"/>
+                    <pic:cNvPicPr/>
+                  </pic:nvPicPr>
+                  <pic:blipFill>
+                    <a:blip r:embed="rId11"/>
+                    <a:stretch>
+                      <a:fillRect/>
+                    </a:stretch>
+                  </pic:blipFill>
+                  <pic:spPr>
+                    <a:xfrm>
+                      <a:off x="0" y="0"/>
+                      <a:ext cx="5760000" cy="2610581"/>
+                    </a:xfrm>
+                    <a:prstGeom prst="rect"/>
+                  </pic:spPr>
+                </pic:pic>
+              </a:graphicData>
+            </a:graphic>
+          </wp:inline>
+        </w:drawing>
+      </w:r>
+    </w:p>
     <w:p>
       <w:pPr>
         <w:spacing w:after="200" w:before="60"/>
@@ -1134,7 +1118,7 @@
           <w:sz w:val="20"/>
           <w:szCs w:val="20"/>
         </w:rPr>
-        <w:t xml:space="preserve">Figure 3.4 – Adding of the second person to the team</w:t>
+        <w:t>Figure 3.4 – Collaborators of the repository</w:t>
       </w:r>
     </w:p>
     <w:p>
@@ -1191,55 +1175,51 @@
           <w:sz w:val="24"/>
           <w:szCs w:val="24"/>
         </w:rPr>
-        <w:t xml:space="preserve">The tasks are shared between the two members of the team: one person makes the analysis, the reports and the planning, the other person makes the code and the diagrams. The finished tasks of Labs 1 and 2 are closed, so their milestones show 100 % progress (Figure 3.10). The subtasks of all milestones are shown in Tables 3.1–3.5.</w:t>
-      </w:r>
-    </w:p>
-    <w:tbl>
-      <w:tblPr>
-        <w:tblW w:type="dxa" w:w="9500"/>
-        <w:tblBorders>
-          <w:top w:val="single" w:color="auto" w:sz="4"/>
-          <w:left w:val="single" w:color="auto" w:sz="4"/>
-          <w:bottom w:val="single" w:color="auto" w:sz="4"/>
-          <w:right w:val="single" w:color="auto" w:sz="4"/>
-          <w:insideH w:val="single" w:color="auto" w:sz="4"/>
-          <w:insideV w:val="single" w:color="auto" w:sz="4"/>
-        </w:tblBorders>
-      </w:tblPr>
-      <w:tblGrid>
-        <w:gridCol w:w="9500"/>
-      </w:tblGrid>
-      <w:tr>
-        <w:tc>
-          <w:tcPr>
-            <w:tcW w:type="dxa" w:w="9500"/>
-            <w:shd w:fill="F2F2F2" w:val="clear"/>
-            <w:tcMar>
-              <w:top w:type="dxa" w:w="500"/>
-              <w:left w:type="dxa" w:w="200"/>
-              <w:bottom w:type="dxa" w:w="500"/>
-              <w:right w:type="dxa" w:w="200"/>
-            </w:tcMar>
-          </w:tcPr>
-          <w:p>
-            <w:pPr>
-              <w:keepNext/>
-              <w:jc w:val="center"/>
-            </w:pPr>
-            <w:r>
-              <w:rPr>
-                <w:rFonts w:ascii="Arial" w:cs="Arial" w:eastAsia="Arial" w:hAnsi="Arial"/>
-                <w:i/>
-                <w:iCs/>
-                <w:sz w:val="20"/>
-                <w:szCs w:val="20"/>
-              </w:rPr>
-              <w:t xml:space="preserve">[ Insert screenshot: Issues → Labels with the labels Epic and SubTask ]</w:t>
-            </w:r>
-          </w:p>
-        </w:tc>
-      </w:tr>
-    </w:tbl>
+        <w:t>All tasks are assigned to the author of the repository, who makes the analysis, the code, the diagrams, the reports and the planning. The finished tasks of Labs 1 and 2 are closed, so their milestones show 100 % progress (Figure 3.10). The subtasks of all milestones are shown in Tables 3.1–3.5.</w:t>
+      </w:r>
+    </w:p>
+    <w:p>
+      <w:pPr>
+        <w:keepNext/>
+        <w:spacing w:before="113"/>
+        <w:ind w:firstLine="0" w:left="0"/>
+        <w:jc w:val="center"/>
+      </w:pPr>
+      <w:r>
+        <w:drawing>
+          <wp:inline xmlns:a="http://schemas.openxmlformats.org/drawingml/2006/main" xmlns:pic="http://schemas.openxmlformats.org/drawingml/2006/picture">
+            <wp:extent cx="5760000" cy="4688072"/>
+            <wp:docPr id="5" name="Picture 5"/>
+            <wp:cNvGraphicFramePr>
+              <a:graphicFrameLocks noChangeAspect="1"/>
+            </wp:cNvGraphicFramePr>
+            <a:graphic>
+              <a:graphicData uri="http://schemas.openxmlformats.org/drawingml/2006/picture">
+                <pic:pic>
+                  <pic:nvPicPr>
+                    <pic:cNvPr id="0" name="figure_3_5.png"/>
+                    <pic:cNvPicPr/>
+                  </pic:nvPicPr>
+                  <pic:blipFill>
+                    <a:blip r:embed="rId12"/>
+                    <a:stretch>
+                      <a:fillRect/>
+                    </a:stretch>
+                  </pic:blipFill>
+                  <pic:spPr>
+                    <a:xfrm>
+                      <a:off x="0" y="0"/>
+                      <a:ext cx="5760000" cy="4688072"/>
+                    </a:xfrm>
+                    <a:prstGeom prst="rect"/>
+                  </pic:spPr>
+                </pic:pic>
+              </a:graphicData>
+            </a:graphic>
+          </wp:inline>
+        </w:drawing>
+      </w:r>
+    </w:p>
     <w:p>
       <w:pPr>
         <w:spacing w:after="200" w:before="60"/>
@@ -1254,52 +1234,48 @@
         <w:t xml:space="preserve">Figure 3.5 – Labels Epic and SubTask</w:t>
       </w:r>
     </w:p>
-    <w:tbl>
-      <w:tblPr>
-        <w:tblW w:type="dxa" w:w="9500"/>
-        <w:tblBorders>
-          <w:top w:val="single" w:color="auto" w:sz="4"/>
-          <w:left w:val="single" w:color="auto" w:sz="4"/>
-          <w:bottom w:val="single" w:color="auto" w:sz="4"/>
-          <w:right w:val="single" w:color="auto" w:sz="4"/>
-          <w:insideH w:val="single" w:color="auto" w:sz="4"/>
-          <w:insideV w:val="single" w:color="auto" w:sz="4"/>
-        </w:tblBorders>
-      </w:tblPr>
-      <w:tblGrid>
-        <w:gridCol w:w="9500"/>
-      </w:tblGrid>
-      <w:tr>
-        <w:tc>
-          <w:tcPr>
-            <w:tcW w:type="dxa" w:w="9500"/>
-            <w:shd w:fill="F2F2F2" w:val="clear"/>
-            <w:tcMar>
-              <w:top w:type="dxa" w:w="500"/>
-              <w:left w:type="dxa" w:w="200"/>
-              <w:bottom w:type="dxa" w:w="500"/>
-              <w:right w:type="dxa" w:w="200"/>
-            </w:tcMar>
-          </w:tcPr>
-          <w:p>
-            <w:pPr>
-              <w:keepNext/>
-              <w:jc w:val="center"/>
-            </w:pPr>
-            <w:r>
-              <w:rPr>
-                <w:rFonts w:ascii="Arial" w:cs="Arial" w:eastAsia="Arial" w:hAnsi="Arial"/>
-                <w:i/>
-                <w:iCs/>
-                <w:sz w:val="20"/>
-                <w:szCs w:val="20"/>
-              </w:rPr>
-              <w:t xml:space="preserve">[ Insert screenshot: Issues → Milestones → New milestone (title, due date, description) ]</w:t>
-            </w:r>
-          </w:p>
-        </w:tc>
-      </w:tr>
-    </w:tbl>
+    <w:p>
+      <w:pPr>
+        <w:keepNext/>
+        <w:spacing w:before="113"/>
+        <w:ind w:firstLine="0" w:left="0"/>
+        <w:jc w:val="center"/>
+      </w:pPr>
+      <w:r>
+        <w:drawing>
+          <wp:inline xmlns:a="http://schemas.openxmlformats.org/drawingml/2006/main" xmlns:pic="http://schemas.openxmlformats.org/drawingml/2006/picture">
+            <wp:extent cx="5760000" cy="2432924"/>
+            <wp:docPr id="6" name="Picture 6"/>
+            <wp:cNvGraphicFramePr>
+              <a:graphicFrameLocks noChangeAspect="1"/>
+            </wp:cNvGraphicFramePr>
+            <a:graphic>
+              <a:graphicData uri="http://schemas.openxmlformats.org/drawingml/2006/picture">
+                <pic:pic>
+                  <pic:nvPicPr>
+                    <pic:cNvPr id="0" name="figure_3_6.png"/>
+                    <pic:cNvPicPr/>
+                  </pic:nvPicPr>
+                  <pic:blipFill>
+                    <a:blip r:embed="rId13"/>
+                    <a:stretch>
+                      <a:fillRect/>
+                    </a:stretch>
+                  </pic:blipFill>
+                  <pic:spPr>
+                    <a:xfrm>
+                      <a:off x="0" y="0"/>
+                      <a:ext cx="5760000" cy="2432924"/>
+                    </a:xfrm>
+                    <a:prstGeom prst="rect"/>
+                  </pic:spPr>
+                </pic:pic>
+              </a:graphicData>
+            </a:graphic>
+          </wp:inline>
+        </w:drawing>
+      </w:r>
+    </w:p>
     <w:p>
       <w:pPr>
         <w:spacing w:after="200" w:before="60"/>
@@ -1314,52 +1290,48 @@
         <w:t xml:space="preserve">Figure 3.6 – Creating of a new milestone</w:t>
       </w:r>
     </w:p>
-    <w:tbl>
-      <w:tblPr>
-        <w:tblW w:type="dxa" w:w="9500"/>
-        <w:tblBorders>
-          <w:top w:val="single" w:color="auto" w:sz="4"/>
-          <w:left w:val="single" w:color="auto" w:sz="4"/>
-          <w:bottom w:val="single" w:color="auto" w:sz="4"/>
-          <w:right w:val="single" w:color="auto" w:sz="4"/>
-          <w:insideH w:val="single" w:color="auto" w:sz="4"/>
-          <w:insideV w:val="single" w:color="auto" w:sz="4"/>
-        </w:tblBorders>
-      </w:tblPr>
-      <w:tblGrid>
-        <w:gridCol w:w="9500"/>
-      </w:tblGrid>
-      <w:tr>
-        <w:tc>
-          <w:tcPr>
-            <w:tcW w:type="dxa" w:w="9500"/>
-            <w:shd w:fill="F2F2F2" w:val="clear"/>
-            <w:tcMar>
-              <w:top w:type="dxa" w:w="500"/>
-              <w:left w:type="dxa" w:w="200"/>
-              <w:bottom w:type="dxa" w:w="500"/>
-              <w:right w:type="dxa" w:w="200"/>
-            </w:tcMar>
-          </w:tcPr>
-          <w:p>
-            <w:pPr>
-              <w:keepNext/>
-              <w:jc w:val="center"/>
-            </w:pPr>
-            <w:r>
-              <w:rPr>
-                <w:rFonts w:ascii="Arial" w:cs="Arial" w:eastAsia="Arial" w:hAnsi="Arial"/>
-                <w:i/>
-                <w:iCs/>
-                <w:sz w:val="20"/>
-                <w:szCs w:val="20"/>
-              </w:rPr>
-              <w:t xml:space="preserve">[ Insert screenshot: the list of all five milestones with their progress ]</w:t>
-            </w:r>
-          </w:p>
-        </w:tc>
-      </w:tr>
-    </w:tbl>
+    <w:p>
+      <w:pPr>
+        <w:keepNext/>
+        <w:spacing w:before="113"/>
+        <w:ind w:firstLine="0" w:left="0"/>
+        <w:jc w:val="center"/>
+      </w:pPr>
+      <w:r>
+        <w:drawing>
+          <wp:inline xmlns:a="http://schemas.openxmlformats.org/drawingml/2006/main" xmlns:pic="http://schemas.openxmlformats.org/drawingml/2006/picture">
+            <wp:extent cx="5760000" cy="3290686"/>
+            <wp:docPr id="7" name="Picture 7"/>
+            <wp:cNvGraphicFramePr>
+              <a:graphicFrameLocks noChangeAspect="1"/>
+            </wp:cNvGraphicFramePr>
+            <a:graphic>
+              <a:graphicData uri="http://schemas.openxmlformats.org/drawingml/2006/picture">
+                <pic:pic>
+                  <pic:nvPicPr>
+                    <pic:cNvPr id="0" name="figure_3_7.png"/>
+                    <pic:cNvPicPr/>
+                  </pic:nvPicPr>
+                  <pic:blipFill>
+                    <a:blip r:embed="rId14"/>
+                    <a:stretch>
+                      <a:fillRect/>
+                    </a:stretch>
+                  </pic:blipFill>
+                  <pic:spPr>
+                    <a:xfrm>
+                      <a:off x="0" y="0"/>
+                      <a:ext cx="5760000" cy="3290686"/>
+                    </a:xfrm>
+                    <a:prstGeom prst="rect"/>
+                  </pic:spPr>
+                </pic:pic>
+              </a:graphicData>
+            </a:graphic>
+          </wp:inline>
+        </w:drawing>
+      </w:r>
+    </w:p>
     <w:p>
       <w:pPr>
         <w:spacing w:after="200" w:before="60"/>
@@ -1374,52 +1346,48 @@
         <w:t xml:space="preserve">Figure 3.7 – Milestones of the project</w:t>
       </w:r>
     </w:p>
-    <w:tbl>
-      <w:tblPr>
-        <w:tblW w:type="dxa" w:w="9500"/>
-        <w:tblBorders>
-          <w:top w:val="single" w:color="auto" w:sz="4"/>
-          <w:left w:val="single" w:color="auto" w:sz="4"/>
-          <w:bottom w:val="single" w:color="auto" w:sz="4"/>
-          <w:right w:val="single" w:color="auto" w:sz="4"/>
-          <w:insideH w:val="single" w:color="auto" w:sz="4"/>
-          <w:insideV w:val="single" w:color="auto" w:sz="4"/>
-        </w:tblBorders>
-      </w:tblPr>
-      <w:tblGrid>
-        <w:gridCol w:w="9500"/>
-      </w:tblGrid>
-      <w:tr>
-        <w:tc>
-          <w:tcPr>
-            <w:tcW w:type="dxa" w:w="9500"/>
-            <w:shd w:fill="F2F2F2" w:val="clear"/>
-            <w:tcMar>
-              <w:top w:type="dxa" w:w="500"/>
-              <w:left w:type="dxa" w:w="200"/>
-              <w:bottom w:type="dxa" w:w="500"/>
-              <w:right w:type="dxa" w:w="200"/>
-            </w:tcMar>
-          </w:tcPr>
-          <w:p>
-            <w:pPr>
-              <w:keepNext/>
-              <w:jc w:val="center"/>
-            </w:pPr>
-            <w:r>
-              <w:rPr>
-                <w:rFonts w:ascii="Arial" w:cs="Arial" w:eastAsia="Arial" w:hAnsi="Arial"/>
-                <w:i/>
-                <w:iCs/>
-                <w:sz w:val="20"/>
-                <w:szCs w:val="20"/>
-              </w:rPr>
-              <w:t xml:space="preserve">[ Insert screenshot: a new issue with the label Epic, the milestone and the assignee ]</w:t>
-            </w:r>
-          </w:p>
-        </w:tc>
-      </w:tr>
-    </w:tbl>
+    <w:p>
+      <w:pPr>
+        <w:keepNext/>
+        <w:spacing w:before="113"/>
+        <w:ind w:firstLine="0" w:left="0"/>
+        <w:jc w:val="center"/>
+      </w:pPr>
+      <w:r>
+        <w:drawing>
+          <wp:inline xmlns:a="http://schemas.openxmlformats.org/drawingml/2006/main" xmlns:pic="http://schemas.openxmlformats.org/drawingml/2006/picture">
+            <wp:extent cx="5760000" cy="3101538"/>
+            <wp:docPr id="8" name="Picture 8"/>
+            <wp:cNvGraphicFramePr>
+              <a:graphicFrameLocks noChangeAspect="1"/>
+            </wp:cNvGraphicFramePr>
+            <a:graphic>
+              <a:graphicData uri="http://schemas.openxmlformats.org/drawingml/2006/picture">
+                <pic:pic>
+                  <pic:nvPicPr>
+                    <pic:cNvPr id="0" name="figure_3_8.png"/>
+                    <pic:cNvPicPr/>
+                  </pic:nvPicPr>
+                  <pic:blipFill>
+                    <a:blip r:embed="rId15"/>
+                    <a:stretch>
+                      <a:fillRect/>
+                    </a:stretch>
+                  </pic:blipFill>
+                  <pic:spPr>
+                    <a:xfrm>
+                      <a:off x="0" y="0"/>
+                      <a:ext cx="5760000" cy="3101538"/>
+                    </a:xfrm>
+                    <a:prstGeom prst="rect"/>
+                  </pic:spPr>
+                </pic:pic>
+              </a:graphicData>
+            </a:graphic>
+          </wp:inline>
+        </w:drawing>
+      </w:r>
+    </w:p>
     <w:p>
       <w:pPr>
         <w:spacing w:after="200" w:before="60"/>
@@ -1434,52 +1402,48 @@
         <w:t xml:space="preserve">Figure 3.8 – Creating of a new epic task</w:t>
       </w:r>
     </w:p>
-    <w:tbl>
-      <w:tblPr>
-        <w:tblW w:type="dxa" w:w="9500"/>
-        <w:tblBorders>
-          <w:top w:val="single" w:color="auto" w:sz="4"/>
-          <w:left w:val="single" w:color="auto" w:sz="4"/>
-          <w:bottom w:val="single" w:color="auto" w:sz="4"/>
-          <w:right w:val="single" w:color="auto" w:sz="4"/>
-          <w:insideH w:val="single" w:color="auto" w:sz="4"/>
-          <w:insideV w:val="single" w:color="auto" w:sz="4"/>
-        </w:tblBorders>
-      </w:tblPr>
-      <w:tblGrid>
-        <w:gridCol w:w="9500"/>
-      </w:tblGrid>
-      <w:tr>
-        <w:tc>
-          <w:tcPr>
-            <w:tcW w:type="dxa" w:w="9500"/>
-            <w:shd w:fill="F2F2F2" w:val="clear"/>
-            <w:tcMar>
-              <w:top w:type="dxa" w:w="500"/>
-              <w:left w:type="dxa" w:w="200"/>
-              <w:bottom w:type="dxa" w:w="500"/>
-              <w:right w:type="dxa" w:w="200"/>
-            </w:tcMar>
-          </w:tcPr>
-          <w:p>
-            <w:pPr>
-              <w:keepNext/>
-              <w:jc w:val="center"/>
-            </w:pPr>
-            <w:r>
-              <w:rPr>
-                <w:rFonts w:ascii="Arial" w:cs="Arial" w:eastAsia="Arial" w:hAnsi="Arial"/>
-                <w:i/>
-                <w:iCs/>
-                <w:sz w:val="20"/>
-                <w:szCs w:val="20"/>
-              </w:rPr>
-              <w:t xml:space="preserve">[ Insert screenshot: a new issue with the label SubTask, the milestone and the assignee ]</w:t>
-            </w:r>
-          </w:p>
-        </w:tc>
-      </w:tr>
-    </w:tbl>
+    <w:p>
+      <w:pPr>
+        <w:keepNext/>
+        <w:spacing w:before="113"/>
+        <w:ind w:firstLine="0" w:left="0"/>
+        <w:jc w:val="center"/>
+      </w:pPr>
+      <w:r>
+        <w:drawing>
+          <wp:inline xmlns:a="http://schemas.openxmlformats.org/drawingml/2006/main" xmlns:pic="http://schemas.openxmlformats.org/drawingml/2006/picture">
+            <wp:extent cx="5760000" cy="3101538"/>
+            <wp:docPr id="9" name="Picture 9"/>
+            <wp:cNvGraphicFramePr>
+              <a:graphicFrameLocks noChangeAspect="1"/>
+            </wp:cNvGraphicFramePr>
+            <a:graphic>
+              <a:graphicData uri="http://schemas.openxmlformats.org/drawingml/2006/picture">
+                <pic:pic>
+                  <pic:nvPicPr>
+                    <pic:cNvPr id="0" name="figure_3_9.png"/>
+                    <pic:cNvPicPr/>
+                  </pic:nvPicPr>
+                  <pic:blipFill>
+                    <a:blip r:embed="rId16"/>
+                    <a:stretch>
+                      <a:fillRect/>
+                    </a:stretch>
+                  </pic:blipFill>
+                  <pic:spPr>
+                    <a:xfrm>
+                      <a:off x="0" y="0"/>
+                      <a:ext cx="5760000" cy="3101538"/>
+                    </a:xfrm>
+                    <a:prstGeom prst="rect"/>
+                  </pic:spPr>
+                </pic:pic>
+              </a:graphicData>
+            </a:graphic>
+          </wp:inline>
+        </w:drawing>
+      </w:r>
+    </w:p>
     <w:p>
       <w:pPr>
         <w:spacing w:after="200" w:before="60"/>
@@ -1494,52 +1458,48 @@
         <w:t xml:space="preserve">Figure 3.9 – Creating of a new subtask</w:t>
       </w:r>
     </w:p>
-    <w:tbl>
-      <w:tblPr>
-        <w:tblW w:type="dxa" w:w="9500"/>
-        <w:tblBorders>
-          <w:top w:val="single" w:color="auto" w:sz="4"/>
-          <w:left w:val="single" w:color="auto" w:sz="4"/>
-          <w:bottom w:val="single" w:color="auto" w:sz="4"/>
-          <w:right w:val="single" w:color="auto" w:sz="4"/>
-          <w:insideH w:val="single" w:color="auto" w:sz="4"/>
-          <w:insideV w:val="single" w:color="auto" w:sz="4"/>
-        </w:tblBorders>
-      </w:tblPr>
-      <w:tblGrid>
-        <w:gridCol w:w="9500"/>
-      </w:tblGrid>
-      <w:tr>
-        <w:tc>
-          <w:tcPr>
-            <w:tcW w:type="dxa" w:w="9500"/>
-            <w:shd w:fill="F2F2F2" w:val="clear"/>
-            <w:tcMar>
-              <w:top w:type="dxa" w:w="500"/>
-              <w:left w:type="dxa" w:w="200"/>
-              <w:bottom w:type="dxa" w:w="500"/>
-              <w:right w:type="dxa" w:w="200"/>
-            </w:tcMar>
-          </w:tcPr>
-          <w:p>
-            <w:pPr>
-              <w:keepNext/>
-              <w:jc w:val="center"/>
-            </w:pPr>
-            <w:r>
-              <w:rPr>
-                <w:rFonts w:ascii="Arial" w:cs="Arial" w:eastAsia="Arial" w:hAnsi="Arial"/>
-                <w:i/>
-                <w:iCs/>
-                <w:sz w:val="20"/>
-                <w:szCs w:val="20"/>
-              </w:rPr>
-              <w:t xml:space="preserve">[ Insert screenshot: the page of the milestone “Iteration 1” with its closed issues ]</w:t>
-            </w:r>
-          </w:p>
-        </w:tc>
-      </w:tr>
-    </w:tbl>
+    <w:p>
+      <w:pPr>
+        <w:keepNext/>
+        <w:spacing w:before="113"/>
+        <w:ind w:firstLine="0" w:left="0"/>
+        <w:jc w:val="center"/>
+      </w:pPr>
+      <w:r>
+        <w:drawing>
+          <wp:inline xmlns:a="http://schemas.openxmlformats.org/drawingml/2006/main" xmlns:pic="http://schemas.openxmlformats.org/drawingml/2006/picture">
+            <wp:extent cx="5760000" cy="3230903"/>
+            <wp:docPr id="10" name="Picture 10"/>
+            <wp:cNvGraphicFramePr>
+              <a:graphicFrameLocks noChangeAspect="1"/>
+            </wp:cNvGraphicFramePr>
+            <a:graphic>
+              <a:graphicData uri="http://schemas.openxmlformats.org/drawingml/2006/picture">
+                <pic:pic>
+                  <pic:nvPicPr>
+                    <pic:cNvPr id="0" name="figure_3_10.png"/>
+                    <pic:cNvPicPr/>
+                  </pic:nvPicPr>
+                  <pic:blipFill>
+                    <a:blip r:embed="rId17"/>
+                    <a:stretch>
+                      <a:fillRect/>
+                    </a:stretch>
+                  </pic:blipFill>
+                  <pic:spPr>
+                    <a:xfrm>
+                      <a:off x="0" y="0"/>
+                      <a:ext cx="5760000" cy="3230903"/>
+                    </a:xfrm>
+                    <a:prstGeom prst="rect"/>
+                  </pic:spPr>
+                </pic:pic>
+              </a:graphicData>
+            </a:graphic>
+          </wp:inline>
+        </w:drawing>
+      </w:r>
+    </w:p>
     <w:p>
       <w:pPr>
         <w:spacing w:after="200" w:before="60"/>
@@ -1867,7 +1827,7 @@
                 <w:sz w:val="20"/>
                 <w:szCs w:val="20"/>
               </w:rPr>
-              <w:t xml:space="preserve">[teammate]</w:t>
+              <w:t>Budkov O.</w:t>
             </w:r>
           </w:p>
         </w:tc>
@@ -2039,7 +1999,7 @@
                 <w:sz w:val="20"/>
                 <w:szCs w:val="20"/>
               </w:rPr>
-              <w:t xml:space="preserve">[teammate]</w:t>
+              <w:t>Budkov O.</w:t>
             </w:r>
           </w:p>
         </w:tc>
@@ -2483,7 +2443,7 @@
                 <w:sz w:val="20"/>
                 <w:szCs w:val="20"/>
               </w:rPr>
-              <w:t xml:space="preserve">[teammate]</w:t>
+              <w:t>Budkov O.</w:t>
             </w:r>
           </w:p>
         </w:tc>
@@ -2569,7 +2529,7 @@
                 <w:sz w:val="20"/>
                 <w:szCs w:val="20"/>
               </w:rPr>
-              <w:t xml:space="preserve">[teammate]</w:t>
+              <w:t>Budkov O.</w:t>
             </w:r>
           </w:p>
         </w:tc>
@@ -2741,7 +2701,7 @@
                 <w:sz w:val="20"/>
                 <w:szCs w:val="20"/>
               </w:rPr>
-              <w:t xml:space="preserve">[teammate]</w:t>
+              <w:t>Budkov O.</w:t>
             </w:r>
           </w:p>
         </w:tc>
@@ -3443,7 +3403,7 @@
                 <w:sz w:val="20"/>
                 <w:szCs w:val="20"/>
               </w:rPr>
-              <w:t xml:space="preserve">[teammate]</w:t>
+              <w:t>Budkov O.</w:t>
             </w:r>
           </w:p>
         </w:tc>
@@ -3529,7 +3489,7 @@
                 <w:sz w:val="20"/>
                 <w:szCs w:val="20"/>
               </w:rPr>
-              <w:t xml:space="preserve">[teammate]</w:t>
+              <w:t>Budkov O.</w:t>
             </w:r>
           </w:p>
         </w:tc>
@@ -3973,7 +3933,7 @@
                 <w:sz w:val="20"/>
                 <w:szCs w:val="20"/>
               </w:rPr>
-              <w:t xml:space="preserve">[teammate]</w:t>
+              <w:t>Budkov O.</w:t>
             </w:r>
           </w:p>
         </w:tc>
@@ -4145,7 +4105,7 @@
                 <w:sz w:val="20"/>
                 <w:szCs w:val="20"/>
               </w:rPr>
-              <w:t xml:space="preserve">[teammate]</w:t>
+              <w:t>Budkov O.</w:t>
             </w:r>
           </w:p>
         </w:tc>
@@ -4589,7 +4549,7 @@
                 <w:sz w:val="20"/>
                 <w:szCs w:val="20"/>
               </w:rPr>
-              <w:t xml:space="preserve">[teammate]</w:t>
+              <w:t>Budkov O.</w:t>
             </w:r>
           </w:p>
         </w:tc>
@@ -4761,7 +4721,7 @@
                 <w:sz w:val="20"/>
                 <w:szCs w:val="20"/>
               </w:rPr>
-              <w:t xml:space="preserve">[teammate]</w:t>
+              <w:t>Budkov O.</w:t>
             </w:r>
           </w:p>
         </w:tc>
@@ -5004,7 +4964,7 @@
           <w:sz w:val="24"/>
           <w:szCs w:val="24"/>
         </w:rPr>
-        <w:t xml:space="preserve">The source code and the reports were added to the repository from Visual Studio: Git → Create Git Repository → Existing remote, with the URL of the repository from the tab “Code” (Figures 3.11–3.12). After that, every change is made in small steps: the changed files are staged, a commit with a short message is created and pushed to github.com (Figures 3.13–3.14). A commit message can name the issue it finishes, for example “Add wireframe of the screens (closes #15)”, and GitHub closes this issue automatically.</w:t>
+        <w:t>The source code and the reports were added to the repository from the command line in the folder of the project: git init, git add ., git commit -m "Add code and reports of Labs 1-3", git branch -M main, git remote add origin https://github.com/oleksiibudkov/SE-Lab-Var3.git and git push -u origin main (Figures 3.11–3.12). After that, every change is made in small steps: the changed files are staged with git add, a commit with a short message is created with git commit and pushed to github.com with git push (Figures 3.13–3.14). A commit message can name the issue it finishes, for example “Add wireframe of the screens (closes #13)”, and GitHub closes this issue automatically.</w:t>
       </w:r>
     </w:p>
     <w:p>
@@ -5018,55 +4978,51 @@
           <w:sz w:val="24"/>
           <w:szCs w:val="24"/>
         </w:rPr>
-        <w:t xml:space="preserve">For the work on a separate issue a new branch was created (Figure 3.15). The changes are made in this branch and then merged into the main branch, so the main branch always has a working version of the program. The history of the commits is shown in Figure 3.16.</w:t>
-      </w:r>
-    </w:p>
-    <w:tbl>
-      <w:tblPr>
-        <w:tblW w:type="dxa" w:w="9500"/>
-        <w:tblBorders>
-          <w:top w:val="single" w:color="auto" w:sz="4"/>
-          <w:left w:val="single" w:color="auto" w:sz="4"/>
-          <w:bottom w:val="single" w:color="auto" w:sz="4"/>
-          <w:right w:val="single" w:color="auto" w:sz="4"/>
-          <w:insideH w:val="single" w:color="auto" w:sz="4"/>
-          <w:insideV w:val="single" w:color="auto" w:sz="4"/>
-        </w:tblBorders>
-      </w:tblPr>
-      <w:tblGrid>
-        <w:gridCol w:w="9500"/>
-      </w:tblGrid>
-      <w:tr>
-        <w:tc>
-          <w:tcPr>
-            <w:tcW w:type="dxa" w:w="9500"/>
-            <w:shd w:fill="F2F2F2" w:val="clear"/>
-            <w:tcMar>
-              <w:top w:type="dxa" w:w="500"/>
-              <w:left w:type="dxa" w:w="200"/>
-              <w:bottom w:type="dxa" w:w="500"/>
-              <w:right w:type="dxa" w:w="200"/>
-            </w:tcMar>
-          </w:tcPr>
-          <w:p>
-            <w:pPr>
-              <w:keepNext/>
-              <w:jc w:val="center"/>
-            </w:pPr>
-            <w:r>
-              <w:rPr>
-                <w:rFonts w:ascii="Arial" w:cs="Arial" w:eastAsia="Arial" w:hAnsi="Arial"/>
-                <w:i/>
-                <w:iCs/>
-                <w:sz w:val="20"/>
-                <w:szCs w:val="20"/>
-              </w:rPr>
-              <w:t xml:space="preserve">[ Insert screenshot: the window “Create a Git repository” with “Existing remote” and the URL ]</w:t>
-            </w:r>
-          </w:p>
-        </w:tc>
-      </w:tr>
-    </w:tbl>
+        <w:t>For the work on a separate issue a new branch lab3-planning was created with git switch -c and pushed to github.com with git push -u origin lab3-planning (Figure 3.15). The changes are made in this branch and then merged into the main branch, so the main branch always has a working version of the program. The history of the commits is shown in Figure 3.16.</w:t>
+      </w:r>
+    </w:p>
+    <w:p>
+      <w:pPr>
+        <w:keepNext/>
+        <w:spacing w:before="113"/>
+        <w:ind w:firstLine="0" w:left="0"/>
+        <w:jc w:val="center"/>
+      </w:pPr>
+      <w:r>
+        <w:drawing>
+          <wp:inline xmlns:a="http://schemas.openxmlformats.org/drawingml/2006/main" xmlns:pic="http://schemas.openxmlformats.org/drawingml/2006/picture">
+            <wp:extent cx="5760000" cy="3000719"/>
+            <wp:docPr id="11" name="Picture 11"/>
+            <wp:cNvGraphicFramePr>
+              <a:graphicFrameLocks noChangeAspect="1"/>
+            </wp:cNvGraphicFramePr>
+            <a:graphic>
+              <a:graphicData uri="http://schemas.openxmlformats.org/drawingml/2006/picture">
+                <pic:pic>
+                  <pic:nvPicPr>
+                    <pic:cNvPr id="0" name="figure_3_11.png"/>
+                    <pic:cNvPicPr/>
+                  </pic:nvPicPr>
+                  <pic:blipFill>
+                    <a:blip r:embed="rId18"/>
+                    <a:stretch>
+                      <a:fillRect/>
+                    </a:stretch>
+                  </pic:blipFill>
+                  <pic:spPr>
+                    <a:xfrm>
+                      <a:off x="0" y="0"/>
+                      <a:ext cx="5760000" cy="3000719"/>
+                    </a:xfrm>
+                    <a:prstGeom prst="rect"/>
+                  </pic:spPr>
+                </pic:pic>
+              </a:graphicData>
+            </a:graphic>
+          </wp:inline>
+        </w:drawing>
+      </w:r>
+    </w:p>
     <w:p>
       <w:pPr>
         <w:spacing w:after="200" w:before="60"/>
@@ -5078,55 +5034,51 @@
           <w:sz w:val="20"/>
           <w:szCs w:val="20"/>
         </w:rPr>
-        <w:t xml:space="preserve">Figure 3.11 – Creating of a Git repository in Visual Studio</w:t>
-      </w:r>
-    </w:p>
-    <w:tbl>
-      <w:tblPr>
-        <w:tblW w:type="dxa" w:w="9500"/>
-        <w:tblBorders>
-          <w:top w:val="single" w:color="auto" w:sz="4"/>
-          <w:left w:val="single" w:color="auto" w:sz="4"/>
-          <w:bottom w:val="single" w:color="auto" w:sz="4"/>
-          <w:right w:val="single" w:color="auto" w:sz="4"/>
-          <w:insideH w:val="single" w:color="auto" w:sz="4"/>
-          <w:insideV w:val="single" w:color="auto" w:sz="4"/>
-        </w:tblBorders>
-      </w:tblPr>
-      <w:tblGrid>
-        <w:gridCol w:w="9500"/>
-      </w:tblGrid>
-      <w:tr>
-        <w:tc>
-          <w:tcPr>
-            <w:tcW w:type="dxa" w:w="9500"/>
-            <w:shd w:fill="F2F2F2" w:val="clear"/>
-            <w:tcMar>
-              <w:top w:type="dxa" w:w="500"/>
-              <w:left w:type="dxa" w:w="200"/>
-              <w:bottom w:type="dxa" w:w="500"/>
-              <w:right w:type="dxa" w:w="200"/>
-            </w:tcMar>
-          </w:tcPr>
-          <w:p>
-            <w:pPr>
-              <w:keepNext/>
-              <w:jc w:val="center"/>
-            </w:pPr>
-            <w:r>
-              <w:rPr>
-                <w:rFonts w:ascii="Arial" w:cs="Arial" w:eastAsia="Arial" w:hAnsi="Arial"/>
-                <w:i/>
-                <w:iCs/>
-                <w:sz w:val="20"/>
-                <w:szCs w:val="20"/>
-              </w:rPr>
-              <w:t xml:space="preserve">[ Insert screenshot: the tab “Code” with the folders src, docs and tools ]</w:t>
-            </w:r>
-          </w:p>
-        </w:tc>
-      </w:tr>
-    </w:tbl>
+        <w:t>Figure 3.11 – Creating of a Git repository from the command line</w:t>
+      </w:r>
+    </w:p>
+    <w:p>
+      <w:pPr>
+        <w:keepNext/>
+        <w:spacing w:before="113"/>
+        <w:ind w:firstLine="0" w:left="0"/>
+        <w:jc w:val="center"/>
+      </w:pPr>
+      <w:r>
+        <w:drawing>
+          <wp:inline xmlns:a="http://schemas.openxmlformats.org/drawingml/2006/main" xmlns:pic="http://schemas.openxmlformats.org/drawingml/2006/picture">
+            <wp:extent cx="5760000" cy="2013506"/>
+            <wp:docPr id="12" name="Picture 12"/>
+            <wp:cNvGraphicFramePr>
+              <a:graphicFrameLocks noChangeAspect="1"/>
+            </wp:cNvGraphicFramePr>
+            <a:graphic>
+              <a:graphicData uri="http://schemas.openxmlformats.org/drawingml/2006/picture">
+                <pic:pic>
+                  <pic:nvPicPr>
+                    <pic:cNvPr id="0" name="figure_3_12.png"/>
+                    <pic:cNvPicPr/>
+                  </pic:nvPicPr>
+                  <pic:blipFill>
+                    <a:blip r:embed="rId19"/>
+                    <a:stretch>
+                      <a:fillRect/>
+                    </a:stretch>
+                  </pic:blipFill>
+                  <pic:spPr>
+                    <a:xfrm>
+                      <a:off x="0" y="0"/>
+                      <a:ext cx="5760000" cy="2013506"/>
+                    </a:xfrm>
+                    <a:prstGeom prst="rect"/>
+                  </pic:spPr>
+                </pic:pic>
+              </a:graphicData>
+            </a:graphic>
+          </wp:inline>
+        </w:drawing>
+      </w:r>
+    </w:p>
     <w:p>
       <w:pPr>
         <w:spacing w:after="200" w:before="60"/>
@@ -5141,52 +5093,48 @@
         <w:t xml:space="preserve">Figure 3.12 – Files of the project on github.com</w:t>
       </w:r>
     </w:p>
-    <w:tbl>
-      <w:tblPr>
-        <w:tblW w:type="dxa" w:w="9500"/>
-        <w:tblBorders>
-          <w:top w:val="single" w:color="auto" w:sz="4"/>
-          <w:left w:val="single" w:color="auto" w:sz="4"/>
-          <w:bottom w:val="single" w:color="auto" w:sz="4"/>
-          <w:right w:val="single" w:color="auto" w:sz="4"/>
-          <w:insideH w:val="single" w:color="auto" w:sz="4"/>
-          <w:insideV w:val="single" w:color="auto" w:sz="4"/>
-        </w:tblBorders>
-      </w:tblPr>
-      <w:tblGrid>
-        <w:gridCol w:w="9500"/>
-      </w:tblGrid>
-      <w:tr>
-        <w:tc>
-          <w:tcPr>
-            <w:tcW w:type="dxa" w:w="9500"/>
-            <w:shd w:fill="F2F2F2" w:val="clear"/>
-            <w:tcMar>
-              <w:top w:type="dxa" w:w="500"/>
-              <w:left w:type="dxa" w:w="200"/>
-              <w:bottom w:type="dxa" w:w="500"/>
-              <w:right w:type="dxa" w:w="200"/>
-            </w:tcMar>
-          </w:tcPr>
-          <w:p>
-            <w:pPr>
-              <w:keepNext/>
-              <w:jc w:val="center"/>
-            </w:pPr>
-            <w:r>
-              <w:rPr>
-                <w:rFonts w:ascii="Arial" w:cs="Arial" w:eastAsia="Arial" w:hAnsi="Arial"/>
-                <w:i/>
-                <w:iCs/>
-                <w:sz w:val="20"/>
-                <w:szCs w:val="20"/>
-              </w:rPr>
-              <w:t xml:space="preserve">[ Insert screenshot: the window “Git Changes” with the staged file and the commit message ]</w:t>
-            </w:r>
-          </w:p>
-        </w:tc>
-      </w:tr>
-    </w:tbl>
+    <w:p>
+      <w:pPr>
+        <w:keepNext/>
+        <w:spacing w:before="113"/>
+        <w:ind w:firstLine="0" w:left="0"/>
+        <w:jc w:val="center"/>
+      </w:pPr>
+      <w:r>
+        <w:drawing>
+          <wp:inline xmlns:a="http://schemas.openxmlformats.org/drawingml/2006/main" xmlns:pic="http://schemas.openxmlformats.org/drawingml/2006/picture">
+            <wp:extent cx="5760000" cy="1914251"/>
+            <wp:docPr id="13" name="Picture 13"/>
+            <wp:cNvGraphicFramePr>
+              <a:graphicFrameLocks noChangeAspect="1"/>
+            </wp:cNvGraphicFramePr>
+            <a:graphic>
+              <a:graphicData uri="http://schemas.openxmlformats.org/drawingml/2006/picture">
+                <pic:pic>
+                  <pic:nvPicPr>
+                    <pic:cNvPr id="0" name="figure_3_13.png"/>
+                    <pic:cNvPicPr/>
+                  </pic:nvPicPr>
+                  <pic:blipFill>
+                    <a:blip r:embed="rId20"/>
+                    <a:stretch>
+                      <a:fillRect/>
+                    </a:stretch>
+                  </pic:blipFill>
+                  <pic:spPr>
+                    <a:xfrm>
+                      <a:off x="0" y="0"/>
+                      <a:ext cx="5760000" cy="1914251"/>
+                    </a:xfrm>
+                    <a:prstGeom prst="rect"/>
+                  </pic:spPr>
+                </pic:pic>
+              </a:graphicData>
+            </a:graphic>
+          </wp:inline>
+        </w:drawing>
+      </w:r>
+    </w:p>
     <w:p>
       <w:pPr>
         <w:spacing w:after="200" w:before="60"/>
@@ -5201,52 +5149,48 @@
         <w:t xml:space="preserve">Figure 3.13 – Committing of the changed file</w:t>
       </w:r>
     </w:p>
-    <w:tbl>
-      <w:tblPr>
-        <w:tblW w:type="dxa" w:w="9500"/>
-        <w:tblBorders>
-          <w:top w:val="single" w:color="auto" w:sz="4"/>
-          <w:left w:val="single" w:color="auto" w:sz="4"/>
-          <w:bottom w:val="single" w:color="auto" w:sz="4"/>
-          <w:right w:val="single" w:color="auto" w:sz="4"/>
-          <w:insideH w:val="single" w:color="auto" w:sz="4"/>
-          <w:insideV w:val="single" w:color="auto" w:sz="4"/>
-        </w:tblBorders>
-      </w:tblPr>
-      <w:tblGrid>
-        <w:gridCol w:w="9500"/>
-      </w:tblGrid>
-      <w:tr>
-        <w:tc>
-          <w:tcPr>
-            <w:tcW w:type="dxa" w:w="9500"/>
-            <w:shd w:fill="F2F2F2" w:val="clear"/>
-            <w:tcMar>
-              <w:top w:type="dxa" w:w="500"/>
-              <w:left w:type="dxa" w:w="200"/>
-              <w:bottom w:type="dxa" w:w="500"/>
-              <w:right w:type="dxa" w:w="200"/>
-            </w:tcMar>
-          </w:tcPr>
-          <w:p>
-            <w:pPr>
-              <w:keepNext/>
-              <w:jc w:val="center"/>
-            </w:pPr>
-            <w:r>
-              <w:rPr>
-                <w:rFonts w:ascii="Arial" w:cs="Arial" w:eastAsia="Arial" w:hAnsi="Arial"/>
-                <w:i/>
-                <w:iCs/>
-                <w:sz w:val="20"/>
-                <w:szCs w:val="20"/>
-              </w:rPr>
-              <w:t xml:space="preserve">[ Insert screenshot: the button Push and the message about the successful push ]</w:t>
-            </w:r>
-          </w:p>
-        </w:tc>
-      </w:tr>
-    </w:tbl>
+    <w:p>
+      <w:pPr>
+        <w:keepNext/>
+        <w:spacing w:before="113"/>
+        <w:ind w:firstLine="0" w:left="0"/>
+        <w:jc w:val="center"/>
+      </w:pPr>
+      <w:r>
+        <w:drawing>
+          <wp:inline xmlns:a="http://schemas.openxmlformats.org/drawingml/2006/main" xmlns:pic="http://schemas.openxmlformats.org/drawingml/2006/picture">
+            <wp:extent cx="5760000" cy="724311"/>
+            <wp:docPr id="14" name="Picture 14"/>
+            <wp:cNvGraphicFramePr>
+              <a:graphicFrameLocks noChangeAspect="1"/>
+            </wp:cNvGraphicFramePr>
+            <a:graphic>
+              <a:graphicData uri="http://schemas.openxmlformats.org/drawingml/2006/picture">
+                <pic:pic>
+                  <pic:nvPicPr>
+                    <pic:cNvPr id="0" name="figure_3_14.png"/>
+                    <pic:cNvPicPr/>
+                  </pic:nvPicPr>
+                  <pic:blipFill>
+                    <a:blip r:embed="rId21"/>
+                    <a:stretch>
+                      <a:fillRect/>
+                    </a:stretch>
+                  </pic:blipFill>
+                  <pic:spPr>
+                    <a:xfrm>
+                      <a:off x="0" y="0"/>
+                      <a:ext cx="5760000" cy="724311"/>
+                    </a:xfrm>
+                    <a:prstGeom prst="rect"/>
+                  </pic:spPr>
+                </pic:pic>
+              </a:graphicData>
+            </a:graphic>
+          </wp:inline>
+        </w:drawing>
+      </w:r>
+    </w:p>
     <w:p>
       <w:pPr>
         <w:spacing w:after="200" w:before="60"/>
@@ -5261,52 +5205,48 @@
         <w:t xml:space="preserve">Figure 3.14 – Pushing of the commit</w:t>
       </w:r>
     </w:p>
-    <w:tbl>
-      <w:tblPr>
-        <w:tblW w:type="dxa" w:w="9500"/>
-        <w:tblBorders>
-          <w:top w:val="single" w:color="auto" w:sz="4"/>
-          <w:left w:val="single" w:color="auto" w:sz="4"/>
-          <w:bottom w:val="single" w:color="auto" w:sz="4"/>
-          <w:right w:val="single" w:color="auto" w:sz="4"/>
-          <w:insideH w:val="single" w:color="auto" w:sz="4"/>
-          <w:insideV w:val="single" w:color="auto" w:sz="4"/>
-        </w:tblBorders>
-      </w:tblPr>
-      <w:tblGrid>
-        <w:gridCol w:w="9500"/>
-      </w:tblGrid>
-      <w:tr>
-        <w:tc>
-          <w:tcPr>
-            <w:tcW w:type="dxa" w:w="9500"/>
-            <w:shd w:fill="F2F2F2" w:val="clear"/>
-            <w:tcMar>
-              <w:top w:type="dxa" w:w="500"/>
-              <w:left w:type="dxa" w:w="200"/>
-              <w:bottom w:type="dxa" w:w="500"/>
-              <w:right w:type="dxa" w:w="200"/>
-            </w:tcMar>
-          </w:tcPr>
-          <w:p>
-            <w:pPr>
-              <w:keepNext/>
-              <w:jc w:val="center"/>
-            </w:pPr>
-            <w:r>
-              <w:rPr>
-                <w:rFonts w:ascii="Arial" w:cs="Arial" w:eastAsia="Arial" w:hAnsi="Arial"/>
-                <w:i/>
-                <w:iCs/>
-                <w:sz w:val="20"/>
-                <w:szCs w:val="20"/>
-              </w:rPr>
-              <w:t xml:space="preserve">[ Insert screenshot: the window “Create a new branch” in Visual Studio or on github.com ]</w:t>
-            </w:r>
-          </w:p>
-        </w:tc>
-      </w:tr>
-    </w:tbl>
+    <w:p>
+      <w:pPr>
+        <w:keepNext/>
+        <w:spacing w:before="113"/>
+        <w:ind w:firstLine="0" w:left="0"/>
+        <w:jc w:val="center"/>
+      </w:pPr>
+      <w:r>
+        <w:drawing>
+          <wp:inline xmlns:a="http://schemas.openxmlformats.org/drawingml/2006/main" xmlns:pic="http://schemas.openxmlformats.org/drawingml/2006/picture">
+            <wp:extent cx="5760000" cy="2023473"/>
+            <wp:docPr id="15" name="Picture 15"/>
+            <wp:cNvGraphicFramePr>
+              <a:graphicFrameLocks noChangeAspect="1"/>
+            </wp:cNvGraphicFramePr>
+            <a:graphic>
+              <a:graphicData uri="http://schemas.openxmlformats.org/drawingml/2006/picture">
+                <pic:pic>
+                  <pic:nvPicPr>
+                    <pic:cNvPr id="0" name="figure_3_15.png"/>
+                    <pic:cNvPicPr/>
+                  </pic:nvPicPr>
+                  <pic:blipFill>
+                    <a:blip r:embed="rId22"/>
+                    <a:stretch>
+                      <a:fillRect/>
+                    </a:stretch>
+                  </pic:blipFill>
+                  <pic:spPr>
+                    <a:xfrm>
+                      <a:off x="0" y="0"/>
+                      <a:ext cx="5760000" cy="2023473"/>
+                    </a:xfrm>
+                    <a:prstGeom prst="rect"/>
+                  </pic:spPr>
+                </pic:pic>
+              </a:graphicData>
+            </a:graphic>
+          </wp:inline>
+        </w:drawing>
+      </w:r>
+    </w:p>
     <w:p>
       <w:pPr>
         <w:spacing w:after="200" w:before="60"/>
@@ -5321,52 +5261,48 @@
         <w:t xml:space="preserve">Figure 3.15 – Creating of a new branch</w:t>
       </w:r>
     </w:p>
-    <w:tbl>
-      <w:tblPr>
-        <w:tblW w:type="dxa" w:w="9500"/>
-        <w:tblBorders>
-          <w:top w:val="single" w:color="auto" w:sz="4"/>
-          <w:left w:val="single" w:color="auto" w:sz="4"/>
-          <w:bottom w:val="single" w:color="auto" w:sz="4"/>
-          <w:right w:val="single" w:color="auto" w:sz="4"/>
-          <w:insideH w:val="single" w:color="auto" w:sz="4"/>
-          <w:insideV w:val="single" w:color="auto" w:sz="4"/>
-        </w:tblBorders>
-      </w:tblPr>
-      <w:tblGrid>
-        <w:gridCol w:w="9500"/>
-      </w:tblGrid>
-      <w:tr>
-        <w:tc>
-          <w:tcPr>
-            <w:tcW w:type="dxa" w:w="9500"/>
-            <w:shd w:fill="F2F2F2" w:val="clear"/>
-            <w:tcMar>
-              <w:top w:type="dxa" w:w="500"/>
-              <w:left w:type="dxa" w:w="200"/>
-              <w:bottom w:type="dxa" w:w="500"/>
-              <w:right w:type="dxa" w:w="200"/>
-            </w:tcMar>
-          </w:tcPr>
-          <w:p>
-            <w:pPr>
-              <w:keepNext/>
-              <w:jc w:val="center"/>
-            </w:pPr>
-            <w:r>
-              <w:rPr>
-                <w:rFonts w:ascii="Arial" w:cs="Arial" w:eastAsia="Arial" w:hAnsi="Arial"/>
-                <w:i/>
-                <w:iCs/>
-                <w:sz w:val="20"/>
-                <w:szCs w:val="20"/>
-              </w:rPr>
-              <w:t xml:space="preserve">[ Insert screenshot: the page Commits of the repository on github.com ]</w:t>
-            </w:r>
-          </w:p>
-        </w:tc>
-      </w:tr>
-    </w:tbl>
+    <w:p>
+      <w:pPr>
+        <w:keepNext/>
+        <w:spacing w:before="113"/>
+        <w:ind w:firstLine="0" w:left="0"/>
+        <w:jc w:val="center"/>
+      </w:pPr>
+      <w:r>
+        <w:drawing>
+          <wp:inline xmlns:a="http://schemas.openxmlformats.org/drawingml/2006/main" xmlns:pic="http://schemas.openxmlformats.org/drawingml/2006/picture">
+            <wp:extent cx="5760000" cy="1278764"/>
+            <wp:docPr id="16" name="Picture 16"/>
+            <wp:cNvGraphicFramePr>
+              <a:graphicFrameLocks noChangeAspect="1"/>
+            </wp:cNvGraphicFramePr>
+            <a:graphic>
+              <a:graphicData uri="http://schemas.openxmlformats.org/drawingml/2006/picture">
+                <pic:pic>
+                  <pic:nvPicPr>
+                    <pic:cNvPr id="0" name="figure_3_16.png"/>
+                    <pic:cNvPicPr/>
+                  </pic:nvPicPr>
+                  <pic:blipFill>
+                    <a:blip r:embed="rId23"/>
+                    <a:stretch>
+                      <a:fillRect/>
+                    </a:stretch>
+                  </pic:blipFill>
+                  <pic:spPr>
+                    <a:xfrm>
+                      <a:off x="0" y="0"/>
+                      <a:ext cx="5760000" cy="1278764"/>
+                    </a:xfrm>
+                    <a:prstGeom prst="rect"/>
+                  </pic:spPr>
+                </pic:pic>
+              </a:graphicData>
+            </a:graphic>
+          </wp:inline>
+        </w:drawing>
+      </w:r>
+    </w:p>
     <w:p>
       <w:pPr>
         <w:spacing w:after="200" w:before="60"/>
@@ -5407,7 +5343,7 @@
           <w:sz w:val="24"/>
           <w:szCs w:val="24"/>
         </w:rPr>
-        <w:t xml:space="preserve">During this laboratory work we got skills and knowledge about working with the project tracking system GitHub. We registered an account, created a repository for the project and added a second member of the team. We chose an iterative life cycle model and planned the work of all laboratory works as five milestones with epic tasks and subtasks, marked them with labels and assigned them to the members of the team. We stored the code and the reports in the git repository, made commits, pushed them to github.com and used a separate branch for the work on an issue.</w:t>
+        <w:t>During this laboratory work we got skills and knowledge about working with the project tracking system GitHub. We registered an account, created a repository for the project and learned how to add collaborators to it. We chose an iterative life cycle model and planned the work of all laboratory works as five milestones with epic tasks and subtasks, marked them with labels and assigned them. We stored the code and the reports in the git repository from the command line, made commits, pushed them to github.com and used a separate branch for the work on an issue.</w:t>
       </w:r>
     </w:p>
     <w:sectPr>

</xml_diff>